<commit_message>
generator pipeline fixed + dynamic naming of generated cv's
</commit_message>
<xml_diff>
--- a/templates/form8_template.docx
+++ b/templates/form8_template.docx
@@ -69,77 +69,6 @@
           <w:lang w:val="en-US"/>
         </w:rPr>
       </w:pPr>
-      <w:r>
-        <w:rPr>
-          <w:rFonts w:asciiTheme="minorHAnsi" w:hAnsiTheme="minorHAnsi" w:cs="Calibri"/>
-          <w:b/>
-          <w:bCs/>
-          <w:noProof/>
-          <w:lang w:val="en-IN"/>
-        </w:rPr>
-        <w:drawing>
-          <wp:anchor distT="0" distB="0" distL="114300" distR="114300" simplePos="0" relativeHeight="251661312" behindDoc="0" locked="0" layoutInCell="1" allowOverlap="1" wp14:anchorId="023E4E10" wp14:editId="1865D775">
-            <wp:simplePos x="0" y="0"/>
-            <wp:positionH relativeFrom="column">
-              <wp:posOffset>4894313</wp:posOffset>
-            </wp:positionH>
-            <wp:positionV relativeFrom="paragraph">
-              <wp:posOffset>173355</wp:posOffset>
-            </wp:positionV>
-            <wp:extent cx="1112520" cy="1161164"/>
-            <wp:effectExtent l="0" t="0" r="0" b="1270"/>
-            <wp:wrapNone/>
-            <wp:docPr id="21" name="Picture 21" descr="A grey silhouette of a person&#10;&#10;AI-generated content may be incorrect."/>
-            <wp:cNvGraphicFramePr>
-              <a:graphicFrameLocks xmlns:a="http://schemas.openxmlformats.org/drawingml/2006/main" noChangeAspect="1"/>
-            </wp:cNvGraphicFramePr>
-            <a:graphic xmlns:a="http://schemas.openxmlformats.org/drawingml/2006/main">
-              <a:graphicData uri="http://schemas.openxmlformats.org/drawingml/2006/picture">
-                <pic:pic xmlns:pic="http://schemas.openxmlformats.org/drawingml/2006/picture">
-                  <pic:nvPicPr>
-                    <pic:cNvPr id="21" name="Picture 21" descr="A grey silhouette of a person&#10;&#10;AI-generated content may be incorrect."/>
-                    <pic:cNvPicPr>
-                      <a:picLocks noChangeAspect="1" noChangeArrowheads="1"/>
-                    </pic:cNvPicPr>
-                  </pic:nvPicPr>
-                  <pic:blipFill>
-                    <a:blip r:embed="rId8" cstate="print">
-                      <a:extLst>
-                        <a:ext uri="{28A0092B-C50C-407E-A947-70E740481C1C}">
-                          <a14:useLocalDpi xmlns:a14="http://schemas.microsoft.com/office/drawing/2010/main" val="0"/>
-                        </a:ext>
-                      </a:extLst>
-                    </a:blip>
-                    <a:srcRect/>
-                    <a:stretch>
-                      <a:fillRect/>
-                    </a:stretch>
-                  </pic:blipFill>
-                  <pic:spPr bwMode="auto">
-                    <a:xfrm>
-                      <a:off x="0" y="0"/>
-                      <a:ext cx="1112520" cy="1161164"/>
-                    </a:xfrm>
-                    <a:prstGeom prst="rect">
-                      <a:avLst/>
-                    </a:prstGeom>
-                    <a:noFill/>
-                    <a:ln>
-                      <a:noFill/>
-                    </a:ln>
-                  </pic:spPr>
-                </pic:pic>
-              </a:graphicData>
-            </a:graphic>
-            <wp14:sizeRelH relativeFrom="page">
-              <wp14:pctWidth>0</wp14:pctWidth>
-            </wp14:sizeRelH>
-            <wp14:sizeRelV relativeFrom="page">
-              <wp14:pctHeight>0</wp14:pctHeight>
-            </wp14:sizeRelV>
-          </wp:anchor>
-        </w:drawing>
-      </w:r>
     </w:p>
     <w:tbl>
       <w:tblPr>
@@ -703,6 +632,58 @@
         </w:tc>
       </w:tr>
     </w:tbl>
+    <w:tbl>
+      <w:tblPr>
+        <w:tblpPr w:leftFromText="180" w:rightFromText="180" w:vertAnchor="text" w:horzAnchor="page" w:tblpX="9352" w:tblpY="-2273"/>
+        <w:tblW w:w="0" w:type="auto"/>
+        <w:tblBorders>
+          <w:top w:val="single" w:sz="4" w:space="0" w:color="auto"/>
+          <w:left w:val="single" w:sz="4" w:space="0" w:color="auto"/>
+          <w:bottom w:val="single" w:sz="4" w:space="0" w:color="auto"/>
+          <w:right w:val="single" w:sz="4" w:space="0" w:color="auto"/>
+          <w:insideH w:val="single" w:sz="4" w:space="0" w:color="auto"/>
+          <w:insideV w:val="single" w:sz="4" w:space="0" w:color="auto"/>
+        </w:tblBorders>
+        <w:tblLook w:val="0000" w:firstRow="0" w:lastRow="0" w:firstColumn="0" w:lastColumn="0" w:noHBand="0" w:noVBand="0"/>
+      </w:tblPr>
+      <w:tblGrid>
+        <w:gridCol w:w="2044"/>
+      </w:tblGrid>
+      <w:tr>
+        <w:trPr>
+          <w:trHeight w:val="2220"/>
+        </w:trPr>
+        <w:tc>
+          <w:tcPr>
+            <w:tcW w:w="2044" w:type="dxa"/>
+            <w:vAlign w:val="center"/>
+          </w:tcPr>
+          <w:p>
+            <w:pPr>
+              <w:spacing w:after="0"/>
+              <w:jc w:val="center"/>
+              <w:rPr>
+                <w:rFonts w:asciiTheme="minorHAnsi" w:hAnsiTheme="minorHAnsi"/>
+              </w:rPr>
+            </w:pPr>
+            <w:r>
+              <w:rPr>
+                <w:rFonts w:asciiTheme="minorHAnsi" w:hAnsiTheme="minorHAnsi"/>
+              </w:rPr>
+              <w:t>{{PHOTO}}</w:t>
+            </w:r>
+          </w:p>
+        </w:tc>
+      </w:tr>
+    </w:tbl>
+    <w:p>
+      <w:pPr>
+        <w:spacing w:after="0"/>
+        <w:rPr>
+          <w:rFonts w:asciiTheme="minorHAnsi" w:hAnsiTheme="minorHAnsi"/>
+        </w:rPr>
+      </w:pPr>
+    </w:p>
     <w:p>
       <w:pPr>
         <w:spacing w:after="0"/>
@@ -1207,7 +1188,7 @@
           <w:p>
             <w:pPr>
               <w:spacing w:before="60" w:after="60" w:line="240" w:lineRule="auto"/>
-              <w:jc w:val="center"/>
+              <w:jc w:val="both"/>
               <w:rPr>
                 <w:rFonts w:ascii="Aptos" w:hAnsi="Aptos"/>
                 <w:lang w:val="en-IN"/>
@@ -1223,6 +1204,7 @@
           <w:p>
             <w:pPr>
               <w:spacing w:before="60" w:after="60" w:line="240" w:lineRule="auto"/>
+              <w:jc w:val="both"/>
               <w:rPr>
                 <w:rFonts w:ascii="Aptos" w:hAnsi="Aptos"/>
                 <w:b/>
@@ -1248,6 +1230,61 @@
               <w:jc w:val="both"/>
               <w:rPr>
                 <w:rFonts w:ascii="Aptos" w:hAnsi="Aptos" w:cs="Calibri"/>
+                <w:color w:val="05436E"/>
+                <w:lang w:val="en-US"/>
+              </w:rPr>
+            </w:pPr>
+            <w:r>
+              <w:rPr>
+                <w:rFonts w:ascii="Aptos" w:hAnsi="Aptos" w:cs="Calibri"/>
+                <w:color w:val="05436E"/>
+                <w:lang w:val="en-US"/>
+              </w:rPr>
+              <w:t>{{</w:t>
+            </w:r>
+            <w:proofErr w:type="spellStart"/>
+            <w:proofErr w:type="gramStart"/>
+            <w:r>
+              <w:rPr>
+                <w:rFonts w:ascii="Aptos" w:hAnsi="Aptos" w:cs="Calibri"/>
+                <w:color w:val="05436E"/>
+                <w:lang w:val="en-US"/>
+              </w:rPr>
+              <w:t>job.</w:t>
+            </w:r>
+            <w:r>
+              <w:rPr>
+                <w:rFonts w:ascii="Aptos" w:hAnsi="Aptos" w:cs="Calibri"/>
+                <w:color w:val="05436E"/>
+                <w:lang w:val="en-US"/>
+              </w:rPr>
+              <w:t>employment</w:t>
+            </w:r>
+            <w:proofErr w:type="gramEnd"/>
+            <w:r>
+              <w:rPr>
+                <w:rFonts w:ascii="Aptos" w:hAnsi="Aptos" w:cs="Calibri"/>
+                <w:color w:val="05436E"/>
+                <w:lang w:val="en-US"/>
+              </w:rPr>
+              <w:t>_period</w:t>
+            </w:r>
+            <w:proofErr w:type="spellEnd"/>
+            <w:r>
+              <w:rPr>
+                <w:rFonts w:ascii="Aptos" w:hAnsi="Aptos" w:cs="Calibri"/>
+                <w:color w:val="05436E"/>
+                <w:lang w:val="en-US"/>
+              </w:rPr>
+              <w:t>}}</w:t>
+            </w:r>
+          </w:p>
+          <w:p>
+            <w:pPr>
+              <w:spacing w:before="60" w:after="60" w:line="240" w:lineRule="auto"/>
+              <w:jc w:val="both"/>
+              <w:rPr>
+                <w:rFonts w:ascii="Aptos" w:hAnsi="Aptos" w:cs="Calibri"/>
                 <w:i/>
                 <w:iCs/>
                 <w:color w:val="05436E"/>
@@ -1257,6 +1294,8 @@
             <w:r>
               <w:rPr>
                 <w:rFonts w:ascii="Aptos" w:hAnsi="Aptos" w:cs="Calibri"/>
+                <w:i/>
+                <w:iCs/>
                 <w:color w:val="05436E"/>
                 <w:lang w:val="en-US"/>
               </w:rPr>
@@ -1267,32 +1306,30 @@
             <w:r>
               <w:rPr>
                 <w:rFonts w:ascii="Aptos" w:hAnsi="Aptos" w:cs="Calibri"/>
+                <w:i/>
+                <w:iCs/>
                 <w:color w:val="05436E"/>
                 <w:lang w:val="en-US"/>
               </w:rPr>
-              <w:t>job.</w:t>
-            </w:r>
+              <w:t>job.employment</w:t>
+            </w:r>
+            <w:proofErr w:type="gramEnd"/>
             <w:r>
               <w:rPr>
                 <w:rFonts w:ascii="Aptos" w:hAnsi="Aptos" w:cs="Calibri"/>
+                <w:i/>
+                <w:iCs/>
                 <w:color w:val="05436E"/>
                 <w:lang w:val="en-US"/>
               </w:rPr>
-              <w:t>employment</w:t>
-            </w:r>
-            <w:proofErr w:type="gramEnd"/>
+              <w:t>_duration</w:t>
+            </w:r>
+            <w:proofErr w:type="spellEnd"/>
             <w:r>
               <w:rPr>
                 <w:rFonts w:ascii="Aptos" w:hAnsi="Aptos" w:cs="Calibri"/>
-                <w:color w:val="05436E"/>
-                <w:lang w:val="en-US"/>
-              </w:rPr>
-              <w:t>_period</w:t>
-            </w:r>
-            <w:proofErr w:type="spellEnd"/>
-            <w:r>
-              <w:rPr>
-                <w:rFonts w:ascii="Aptos" w:hAnsi="Aptos" w:cs="Calibri"/>
+                <w:i/>
+                <w:iCs/>
                 <w:color w:val="05436E"/>
                 <w:lang w:val="en-US"/>
               </w:rPr>
@@ -1475,16 +1512,16 @@
                 <w:rFonts w:ascii="Aptos" w:hAnsi="Aptos"/>
                 <w:b/>
                 <w:bCs/>
-                <w:color w:val="BF4E14" w:themeColor="accent2" w:themeShade="BF"/>
-                <w:lang w:val="en-IN"/>
-              </w:rPr>
-            </w:pPr>
-            <w:r>
-              <w:rPr>
-                <w:rFonts w:ascii="Aptos" w:hAnsi="Aptos"/>
-                <w:b/>
-                <w:bCs/>
-                <w:color w:val="BF4E14" w:themeColor="accent2" w:themeShade="BF"/>
+                <w:color w:val="000000" w:themeColor="text1"/>
+                <w:lang w:val="en-IN"/>
+              </w:rPr>
+            </w:pPr>
+            <w:r>
+              <w:rPr>
+                <w:rFonts w:ascii="Aptos" w:hAnsi="Aptos"/>
+                <w:b/>
+                <w:bCs/>
+                <w:color w:val="000000" w:themeColor="text1"/>
                 <w:lang w:val="en-IN"/>
               </w:rPr>
               <w:t>For References:</w:t>
@@ -1496,16 +1533,16 @@
               <w:jc w:val="both"/>
               <w:rPr>
                 <w:rFonts w:ascii="Aptos" w:hAnsi="Aptos"/>
-                <w:color w:val="BF4E14" w:themeColor="accent2" w:themeShade="BF"/>
-                <w:lang w:val="en-IN"/>
-              </w:rPr>
-            </w:pPr>
-            <w:r>
-              <w:rPr>
-                <w:rFonts w:ascii="Aptos" w:hAnsi="Aptos"/>
-                <w:b/>
-                <w:bCs/>
-                <w:color w:val="BF4E14" w:themeColor="accent2" w:themeShade="BF"/>
+                <w:color w:val="000000" w:themeColor="text1"/>
+                <w:lang w:val="en-IN"/>
+              </w:rPr>
+            </w:pPr>
+            <w:r>
+              <w:rPr>
+                <w:rFonts w:ascii="Aptos" w:hAnsi="Aptos"/>
+                <w:b/>
+                <w:bCs/>
+                <w:color w:val="000000" w:themeColor="text1"/>
                 <w:lang w:val="en-IN"/>
               </w:rPr>
               <w:t xml:space="preserve">Name: </w:t>
@@ -1513,7 +1550,7 @@
             <w:r>
               <w:rPr>
                 <w:rFonts w:ascii="Aptos" w:hAnsi="Aptos"/>
-                <w:color w:val="BF4E14" w:themeColor="accent2" w:themeShade="BF"/>
+                <w:color w:val="000000" w:themeColor="text1"/>
                 <w:lang w:val="en-IN"/>
               </w:rPr>
               <w:t>{{</w:t>
@@ -1522,7 +1559,7 @@
             <w:r>
               <w:rPr>
                 <w:rFonts w:ascii="Aptos" w:hAnsi="Aptos"/>
-                <w:color w:val="BF4E14" w:themeColor="accent2" w:themeShade="BF"/>
+                <w:color w:val="000000" w:themeColor="text1"/>
                 <w:lang w:val="en-IN"/>
               </w:rPr>
               <w:t>job.</w:t>
@@ -1530,7 +1567,7 @@
             <w:r>
               <w:rPr>
                 <w:rFonts w:ascii="Aptos" w:hAnsi="Aptos"/>
-                <w:color w:val="BF4E14" w:themeColor="accent2" w:themeShade="BF"/>
+                <w:color w:val="000000" w:themeColor="text1"/>
                 <w:lang w:val="en-IN"/>
               </w:rPr>
               <w:t>reference_name</w:t>
@@ -1539,7 +1576,7 @@
             <w:r>
               <w:rPr>
                 <w:rFonts w:ascii="Aptos" w:hAnsi="Aptos"/>
-                <w:color w:val="BF4E14" w:themeColor="accent2" w:themeShade="BF"/>
+                <w:color w:val="000000" w:themeColor="text1"/>
                 <w:lang w:val="en-IN"/>
               </w:rPr>
               <w:t>}}</w:t>
@@ -1551,16 +1588,16 @@
               <w:jc w:val="both"/>
               <w:rPr>
                 <w:rFonts w:ascii="Aptos" w:hAnsi="Aptos"/>
-                <w:color w:val="BF4E14" w:themeColor="accent2" w:themeShade="BF"/>
-                <w:lang w:val="en-IN"/>
-              </w:rPr>
-            </w:pPr>
-            <w:r>
-              <w:rPr>
-                <w:rFonts w:ascii="Aptos" w:hAnsi="Aptos"/>
-                <w:b/>
-                <w:bCs/>
-                <w:color w:val="BF4E14" w:themeColor="accent2" w:themeShade="BF"/>
+                <w:color w:val="000000" w:themeColor="text1"/>
+                <w:lang w:val="en-IN"/>
+              </w:rPr>
+            </w:pPr>
+            <w:r>
+              <w:rPr>
+                <w:rFonts w:ascii="Aptos" w:hAnsi="Aptos"/>
+                <w:b/>
+                <w:bCs/>
+                <w:color w:val="000000" w:themeColor="text1"/>
                 <w:lang w:val="en-IN"/>
               </w:rPr>
               <w:t xml:space="preserve">Position: </w:t>
@@ -1568,7 +1605,7 @@
             <w:r>
               <w:rPr>
                 <w:rFonts w:ascii="Aptos" w:hAnsi="Aptos"/>
-                <w:color w:val="BF4E14" w:themeColor="accent2" w:themeShade="BF"/>
+                <w:color w:val="000000" w:themeColor="text1"/>
                 <w:lang w:val="en-IN"/>
               </w:rPr>
               <w:t>{{</w:t>
@@ -1577,7 +1614,7 @@
             <w:r>
               <w:rPr>
                 <w:rFonts w:ascii="Aptos" w:hAnsi="Aptos"/>
-                <w:color w:val="BF4E14" w:themeColor="accent2" w:themeShade="BF"/>
+                <w:color w:val="000000" w:themeColor="text1"/>
                 <w:lang w:val="en-IN"/>
               </w:rPr>
               <w:t>job.</w:t>
@@ -1585,7 +1622,7 @@
             <w:r>
               <w:rPr>
                 <w:rFonts w:ascii="Aptos" w:hAnsi="Aptos"/>
-                <w:color w:val="BF4E14" w:themeColor="accent2" w:themeShade="BF"/>
+                <w:color w:val="000000" w:themeColor="text1"/>
                 <w:lang w:val="en-IN"/>
               </w:rPr>
               <w:t>reference_position</w:t>
@@ -1594,7 +1631,7 @@
             <w:r>
               <w:rPr>
                 <w:rFonts w:ascii="Aptos" w:hAnsi="Aptos"/>
-                <w:color w:val="BF4E14" w:themeColor="accent2" w:themeShade="BF"/>
+                <w:color w:val="000000" w:themeColor="text1"/>
                 <w:lang w:val="en-IN"/>
               </w:rPr>
               <w:t>}}</w:t>
@@ -1606,16 +1643,16 @@
               <w:jc w:val="both"/>
               <w:rPr>
                 <w:rFonts w:ascii="Aptos" w:hAnsi="Aptos"/>
-                <w:color w:val="BF4E14" w:themeColor="accent2" w:themeShade="BF"/>
-                <w:lang w:val="en-IN"/>
-              </w:rPr>
-            </w:pPr>
-            <w:r>
-              <w:rPr>
-                <w:rFonts w:ascii="Aptos" w:hAnsi="Aptos"/>
-                <w:b/>
-                <w:bCs/>
-                <w:color w:val="BF4E14" w:themeColor="accent2" w:themeShade="BF"/>
+                <w:color w:val="000000" w:themeColor="text1"/>
+                <w:lang w:val="en-IN"/>
+              </w:rPr>
+            </w:pPr>
+            <w:r>
+              <w:rPr>
+                <w:rFonts w:ascii="Aptos" w:hAnsi="Aptos"/>
+                <w:b/>
+                <w:bCs/>
+                <w:color w:val="000000" w:themeColor="text1"/>
                 <w:lang w:val="en-IN"/>
               </w:rPr>
               <w:t xml:space="preserve">Tel: </w:t>
@@ -1623,7 +1660,7 @@
             <w:r>
               <w:rPr>
                 <w:rFonts w:ascii="Aptos" w:hAnsi="Aptos"/>
-                <w:color w:val="BF4E14" w:themeColor="accent2" w:themeShade="BF"/>
+                <w:color w:val="000000" w:themeColor="text1"/>
                 <w:lang w:val="en-IN"/>
               </w:rPr>
               <w:t>{{</w:t>
@@ -1632,7 +1669,7 @@
             <w:r>
               <w:rPr>
                 <w:rFonts w:ascii="Aptos" w:hAnsi="Aptos"/>
-                <w:color w:val="BF4E14" w:themeColor="accent2" w:themeShade="BF"/>
+                <w:color w:val="000000" w:themeColor="text1"/>
                 <w:lang w:val="en-IN"/>
               </w:rPr>
               <w:t>job.</w:t>
@@ -1640,7 +1677,7 @@
             <w:r>
               <w:rPr>
                 <w:rFonts w:ascii="Aptos" w:hAnsi="Aptos"/>
-                <w:color w:val="BF4E14" w:themeColor="accent2" w:themeShade="BF"/>
+                <w:color w:val="000000" w:themeColor="text1"/>
                 <w:lang w:val="en-IN"/>
               </w:rPr>
               <w:t>reference_tel</w:t>
@@ -1649,7 +1686,7 @@
             <w:r>
               <w:rPr>
                 <w:rFonts w:ascii="Aptos" w:hAnsi="Aptos"/>
-                <w:color w:val="BF4E14" w:themeColor="accent2" w:themeShade="BF"/>
+                <w:color w:val="000000" w:themeColor="text1"/>
                 <w:lang w:val="en-IN"/>
               </w:rPr>
               <w:t>}}</w:t>
@@ -1670,15 +1707,16 @@
                 <w:rFonts w:ascii="Aptos" w:hAnsi="Aptos"/>
                 <w:b/>
                 <w:bCs/>
-                <w:color w:val="BF4E14" w:themeColor="accent2" w:themeShade="BF"/>
-                <w:lang w:val="en-IN"/>
-              </w:rPr>
+                <w:color w:val="000000" w:themeColor="text1"/>
+                <w:lang w:val="en-IN"/>
+              </w:rPr>
+              <w:lastRenderedPageBreak/>
               <w:t xml:space="preserve">Email: </w:t>
             </w:r>
             <w:r>
               <w:rPr>
                 <w:rFonts w:ascii="Aptos" w:hAnsi="Aptos"/>
-                <w:color w:val="BF4E14" w:themeColor="accent2" w:themeShade="BF"/>
+                <w:color w:val="000000" w:themeColor="text1"/>
                 <w:lang w:val="en-IN"/>
               </w:rPr>
               <w:t>{{</w:t>
@@ -1687,7 +1725,7 @@
             <w:r>
               <w:rPr>
                 <w:rFonts w:ascii="Aptos" w:hAnsi="Aptos"/>
-                <w:color w:val="BF4E14" w:themeColor="accent2" w:themeShade="BF"/>
+                <w:color w:val="000000" w:themeColor="text1"/>
                 <w:lang w:val="en-IN"/>
               </w:rPr>
               <w:t>job.</w:t>
@@ -1695,7 +1733,7 @@
             <w:r>
               <w:rPr>
                 <w:rFonts w:ascii="Aptos" w:hAnsi="Aptos"/>
-                <w:color w:val="BF4E14" w:themeColor="accent2" w:themeShade="BF"/>
+                <w:color w:val="000000" w:themeColor="text1"/>
                 <w:lang w:val="en-IN"/>
               </w:rPr>
               <w:t>reference_email</w:t>
@@ -1704,7 +1742,7 @@
             <w:r>
               <w:rPr>
                 <w:rFonts w:ascii="Aptos" w:hAnsi="Aptos"/>
-                <w:color w:val="BF4E14" w:themeColor="accent2" w:themeShade="BF"/>
+                <w:color w:val="000000" w:themeColor="text1"/>
                 <w:lang w:val="en-IN"/>
               </w:rPr>
               <w:t>}}</w:t>
@@ -1719,17 +1757,18 @@
           <w:p>
             <w:pPr>
               <w:spacing w:before="60" w:after="60" w:line="240" w:lineRule="auto"/>
-              <w:jc w:val="center"/>
-              <w:rPr>
-                <w:rFonts w:ascii="Aptos" w:hAnsi="Aptos"/>
-                <w:lang w:val="en-IN"/>
-              </w:rPr>
-            </w:pPr>
-            <w:r>
-              <w:rPr>
-                <w:rFonts w:ascii="Aptos" w:hAnsi="Aptos"/>
-                <w:lang w:val="en-IN"/>
-              </w:rPr>
+              <w:jc w:val="both"/>
+              <w:rPr>
+                <w:rFonts w:ascii="Aptos" w:hAnsi="Aptos"/>
+                <w:lang w:val="en-IN"/>
+              </w:rPr>
+            </w:pPr>
+            <w:r>
+              <w:rPr>
+                <w:rFonts w:ascii="Aptos" w:hAnsi="Aptos"/>
+                <w:lang w:val="en-IN"/>
+              </w:rPr>
+              <w:lastRenderedPageBreak/>
               <w:t>{{</w:t>
             </w:r>
             <w:proofErr w:type="spellStart"/>
@@ -1776,6 +1815,7 @@
           <w:p>
             <w:pPr>
               <w:spacing w:before="60" w:after="60" w:line="240" w:lineRule="auto"/>
+              <w:jc w:val="both"/>
               <w:rPr>
                 <w:rFonts w:ascii="Aptos" w:hAnsi="Aptos"/>
                 <w:b/>
@@ -1827,6 +1867,7 @@
           <w:p>
             <w:pPr>
               <w:spacing w:before="60" w:after="60" w:line="240" w:lineRule="auto"/>
+              <w:jc w:val="both"/>
               <w:rPr>
                 <w:rFonts w:ascii="Aptos" w:hAnsi="Aptos"/>
                 <w:b/>
@@ -1839,6 +1880,7 @@
           <w:p>
             <w:pPr>
               <w:spacing w:before="60" w:after="60" w:line="240" w:lineRule="auto"/>
+              <w:jc w:val="both"/>
               <w:rPr>
                 <w:rFonts w:ascii="Aptos" w:hAnsi="Aptos"/>
                 <w:b/>
@@ -1869,7 +1911,7 @@
             <w:r>
               <w:rPr>
                 <w:rFonts w:ascii="Aptos" w:hAnsi="Aptos"/>
-                <w:color w:val="156082" w:themeColor="accent1"/>
+                <w:color w:val="000000" w:themeColor="text1"/>
                 <w:lang w:val="en-IN"/>
               </w:rPr>
               <w:t>{{</w:t>
@@ -1878,7 +1920,7 @@
             <w:r>
               <w:rPr>
                 <w:rFonts w:ascii="Aptos" w:hAnsi="Aptos"/>
-                <w:color w:val="156082" w:themeColor="accent1"/>
+                <w:color w:val="000000" w:themeColor="text1"/>
                 <w:lang w:val="en-IN"/>
               </w:rPr>
               <w:t>job.</w:t>
@@ -1886,7 +1928,7 @@
             <w:r>
               <w:rPr>
                 <w:rFonts w:ascii="Aptos" w:hAnsi="Aptos"/>
-                <w:color w:val="156082" w:themeColor="accent1"/>
+                <w:color w:val="000000" w:themeColor="text1"/>
                 <w:lang w:val="en-IN"/>
               </w:rPr>
               <w:t>assignment_project_name</w:t>
@@ -1895,7 +1937,7 @@
             <w:r>
               <w:rPr>
                 <w:rFonts w:ascii="Aptos" w:hAnsi="Aptos"/>
-                <w:color w:val="156082" w:themeColor="accent1"/>
+                <w:color w:val="000000" w:themeColor="text1"/>
                 <w:lang w:val="en-IN"/>
               </w:rPr>
               <w:t>}}</w:t>
@@ -1905,7 +1947,7 @@
                 <w:rFonts w:ascii="Aptos" w:hAnsi="Aptos"/>
                 <w:b/>
                 <w:bCs/>
-                <w:color w:val="156082" w:themeColor="accent1"/>
+                <w:color w:val="000000" w:themeColor="text1"/>
                 <w:lang w:val="en-IN"/>
               </w:rPr>
               <w:t xml:space="preserve"> </w:t>
@@ -1914,6 +1956,7 @@
           <w:p>
             <w:pPr>
               <w:spacing w:before="60" w:after="60" w:line="240" w:lineRule="auto"/>
+              <w:jc w:val="both"/>
               <w:rPr>
                 <w:rFonts w:ascii="Aptos" w:hAnsi="Aptos"/>
                 <w:b/>
@@ -1928,10 +1971,9 @@
           <w:p>
             <w:pPr>
               <w:spacing w:before="60" w:after="60" w:line="240" w:lineRule="auto"/>
-              <w:rPr>
-                <w:rFonts w:ascii="Aptos" w:hAnsi="Aptos"/>
-                <w:b/>
-                <w:bCs/>
+              <w:jc w:val="both"/>
+              <w:rPr>
+                <w:rFonts w:ascii="Aptos" w:hAnsi="Aptos"/>
                 <w:lang w:val="en-IN"/>
               </w:rPr>
             </w:pPr>
@@ -1947,8 +1989,6 @@
             <w:r>
               <w:rPr>
                 <w:rFonts w:ascii="Aptos" w:hAnsi="Aptos"/>
-                <w:b/>
-                <w:bCs/>
                 <w:lang w:val="en-IN"/>
               </w:rPr>
               <w:t>{{</w:t>
@@ -1957,8 +1997,6 @@
             <w:r>
               <w:rPr>
                 <w:rFonts w:ascii="Aptos" w:hAnsi="Aptos"/>
-                <w:b/>
-                <w:bCs/>
                 <w:lang w:val="en-IN"/>
               </w:rPr>
               <w:t>job.</w:t>
@@ -1966,8 +2004,6 @@
             <w:r>
               <w:rPr>
                 <w:rFonts w:ascii="Aptos" w:hAnsi="Aptos"/>
-                <w:b/>
-                <w:bCs/>
                 <w:lang w:val="en-IN"/>
               </w:rPr>
               <w:t>client</w:t>
@@ -1976,8 +2012,6 @@
             <w:r>
               <w:rPr>
                 <w:rFonts w:ascii="Aptos" w:hAnsi="Aptos"/>
-                <w:b/>
-                <w:bCs/>
                 <w:lang w:val="en-IN"/>
               </w:rPr>
               <w:t>}}</w:t>
@@ -1986,6 +2020,7 @@
           <w:p>
             <w:pPr>
               <w:spacing w:before="60" w:after="60" w:line="240" w:lineRule="auto"/>
+              <w:jc w:val="both"/>
               <w:rPr>
                 <w:rFonts w:ascii="Aptos" w:hAnsi="Aptos"/>
                 <w:lang w:val="en-IN"/>
@@ -1995,17 +2030,27 @@
           <w:p>
             <w:pPr>
               <w:spacing w:before="60" w:after="60" w:line="240" w:lineRule="auto"/>
-              <w:rPr>
-                <w:rFonts w:ascii="Aptos" w:hAnsi="Aptos"/>
-                <w:lang w:val="en-IN"/>
-              </w:rPr>
-            </w:pPr>
-            <w:r>
-              <w:rPr>
-                <w:rFonts w:ascii="Aptos" w:hAnsi="Aptos"/>
-                <w:lang w:val="en-IN"/>
-              </w:rPr>
-              <w:t xml:space="preserve">Year: </w:t>
+              <w:jc w:val="both"/>
+              <w:rPr>
+                <w:rFonts w:ascii="Aptos" w:hAnsi="Aptos"/>
+                <w:lang w:val="en-IN"/>
+              </w:rPr>
+            </w:pPr>
+            <w:r>
+              <w:rPr>
+                <w:rFonts w:ascii="Aptos" w:hAnsi="Aptos"/>
+                <w:b/>
+                <w:bCs/>
+                <w:lang w:val="en-IN"/>
+              </w:rPr>
+              <w:t>Year:</w:t>
+            </w:r>
+            <w:r>
+              <w:rPr>
+                <w:rFonts w:ascii="Aptos" w:hAnsi="Aptos"/>
+                <w:lang w:val="en-IN"/>
+              </w:rPr>
+              <w:t xml:space="preserve"> </w:t>
             </w:r>
             <w:r>
               <w:rPr>
@@ -2041,6 +2086,7 @@
           <w:p>
             <w:pPr>
               <w:spacing w:before="60" w:after="60" w:line="240" w:lineRule="auto"/>
+              <w:jc w:val="both"/>
               <w:rPr>
                 <w:rFonts w:ascii="Aptos" w:hAnsi="Aptos"/>
                 <w:lang w:val="en-IN"/>
@@ -2050,6 +2096,7 @@
           <w:p>
             <w:pPr>
               <w:spacing w:before="60" w:after="60" w:line="240" w:lineRule="auto"/>
+              <w:jc w:val="both"/>
               <w:rPr>
                 <w:rFonts w:ascii="Aptos" w:hAnsi="Aptos"/>
                 <w:lang w:val="en-IN"/>
@@ -2098,6 +2145,7 @@
           <w:p>
             <w:pPr>
               <w:spacing w:before="60" w:after="60" w:line="240" w:lineRule="auto"/>
+              <w:jc w:val="both"/>
               <w:rPr>
                 <w:rFonts w:ascii="Aptos" w:hAnsi="Aptos"/>
                 <w:lang w:val="en-IN"/>
@@ -2107,9 +2155,10 @@
           <w:p>
             <w:pPr>
               <w:spacing w:before="60" w:after="60" w:line="240" w:lineRule="auto"/>
-              <w:rPr>
-                <w:rFonts w:ascii="Aptos" w:hAnsi="Aptos"/>
-                <w:lang w:val="en-US"/>
+              <w:jc w:val="both"/>
+              <w:rPr>
+                <w:rFonts w:ascii="Aptos" w:hAnsi="Aptos"/>
+                <w:lang w:val="en-IN"/>
               </w:rPr>
             </w:pPr>
             <w:r>
@@ -2135,7 +2184,7 @@
                 <w:rFonts w:ascii="Aptos" w:hAnsi="Aptos"/>
                 <w:lang w:val="en-IN"/>
               </w:rPr>
-              <w:t>{{</w:t>
+              <w:t xml:space="preserve">{% for activity in </w:t>
             </w:r>
             <w:proofErr w:type="spellStart"/>
             <w:r>
@@ -2143,14 +2192,7 @@
                 <w:rFonts w:ascii="Aptos" w:hAnsi="Aptos"/>
                 <w:lang w:val="en-IN"/>
               </w:rPr>
-              <w:t>job.</w:t>
-            </w:r>
-            <w:r>
-              <w:rPr>
-                <w:rFonts w:ascii="Aptos" w:hAnsi="Aptos"/>
-                <w:lang w:val="en-IN"/>
-              </w:rPr>
-              <w:t>activities_performed</w:t>
+              <w:t>job.activities_performed</w:t>
             </w:r>
             <w:proofErr w:type="spellEnd"/>
             <w:r>
@@ -2158,7 +2200,57 @@
                 <w:rFonts w:ascii="Aptos" w:hAnsi="Aptos"/>
                 <w:lang w:val="en-IN"/>
               </w:rPr>
-              <w:t>}}</w:t>
+              <w:t xml:space="preserve"> %}</w:t>
+            </w:r>
+          </w:p>
+          <w:p>
+            <w:pPr>
+              <w:spacing w:before="60" w:after="60" w:line="240" w:lineRule="auto"/>
+              <w:jc w:val="both"/>
+              <w:rPr>
+                <w:rFonts w:ascii="Aptos" w:hAnsi="Aptos"/>
+                <w:lang w:val="en-IN"/>
+              </w:rPr>
+            </w:pPr>
+            <w:r>
+              <w:rPr>
+                <w:rFonts w:ascii="Aptos" w:hAnsi="Aptos"/>
+                <w:lang w:val="en-IN"/>
+              </w:rPr>
+              <w:t>• {{activity}}</w:t>
+            </w:r>
+          </w:p>
+          <w:p>
+            <w:pPr>
+              <w:spacing w:before="60" w:after="60" w:line="240" w:lineRule="auto"/>
+              <w:jc w:val="both"/>
+              <w:rPr>
+                <w:rFonts w:ascii="Aptos" w:hAnsi="Aptos"/>
+                <w:lang w:val="en-US"/>
+              </w:rPr>
+            </w:pPr>
+            <w:r>
+              <w:rPr>
+                <w:rFonts w:ascii="Aptos" w:hAnsi="Aptos"/>
+                <w:lang w:val="en-IN"/>
+              </w:rPr>
+              <w:t xml:space="preserve">{% </w:t>
+            </w:r>
+            <w:proofErr w:type="spellStart"/>
+            <w:r>
+              <w:rPr>
+                <w:rFonts w:ascii="Aptos" w:hAnsi="Aptos"/>
+                <w:lang w:val="en-IN"/>
+              </w:rPr>
+              <w:t>endfor</w:t>
+            </w:r>
+            <w:proofErr w:type="spellEnd"/>
+            <w:r>
+              <w:rPr>
+                <w:rFonts w:ascii="Aptos" w:hAnsi="Aptos"/>
+                <w:lang w:val="en-IN"/>
+              </w:rPr>
+              <w:t xml:space="preserve"> %}</w:t>
             </w:r>
             <w:r>
               <w:rPr>
@@ -2197,7 +2289,6 @@
                 <w:color w:val="05436E"/>
                 <w:lang w:val="en-US"/>
               </w:rPr>
-              <w:lastRenderedPageBreak/>
               <w:t xml:space="preserve">{%tr </w:t>
             </w:r>
             <w:proofErr w:type="spellStart"/>
@@ -2245,7 +2336,7 @@
           <w:p>
             <w:pPr>
               <w:spacing w:before="60" w:after="60" w:line="240" w:lineRule="auto"/>
-              <w:jc w:val="center"/>
+              <w:jc w:val="both"/>
               <w:rPr>
                 <w:rFonts w:ascii="Aptos" w:hAnsi="Aptos"/>
                 <w:lang w:val="en-IN"/>
@@ -2261,6 +2352,7 @@
           <w:p>
             <w:pPr>
               <w:spacing w:before="60" w:after="60" w:line="240" w:lineRule="auto"/>
+              <w:jc w:val="both"/>
               <w:rPr>
                 <w:rFonts w:ascii="Aptos" w:hAnsi="Aptos"/>
                 <w:b/>
@@ -2280,6 +2372,22 @@
           <w:lang w:val="en-US"/>
         </w:rPr>
       </w:pPr>
+    </w:p>
+    <w:p>
+      <w:pPr>
+        <w:spacing w:after="160" w:line="278" w:lineRule="auto"/>
+        <w:rPr>
+          <w:rFonts w:asciiTheme="minorHAnsi" w:hAnsiTheme="minorHAnsi"/>
+          <w:lang w:val="en-US"/>
+        </w:rPr>
+      </w:pPr>
+      <w:r>
+        <w:rPr>
+          <w:rFonts w:asciiTheme="minorHAnsi" w:hAnsiTheme="minorHAnsi"/>
+          <w:lang w:val="en-US"/>
+        </w:rPr>
+        <w:br w:type="page"/>
+      </w:r>
     </w:p>
     <w:p>
       <w:pPr>
@@ -2387,7 +2495,7 @@
           <w:p>
             <w:pPr>
               <w:spacing w:after="0" w:line="240" w:lineRule="auto"/>
-              <w:jc w:val="center"/>
+              <w:jc w:val="both"/>
               <w:cnfStyle w:val="000000100000" w:firstRow="0" w:lastRow="0" w:firstColumn="0" w:lastColumn="0" w:oddVBand="0" w:evenVBand="0" w:oddHBand="1" w:evenHBand="0" w:firstRowFirstColumn="0" w:firstRowLastColumn="0" w:lastRowFirstColumn="0" w:lastRowLastColumn="0"/>
               <w:rPr>
                 <w:rFonts w:asciiTheme="minorHAnsi" w:hAnsiTheme="minorHAnsi" w:cs="Calibri"/>
@@ -2421,6 +2529,7 @@
               <w:pStyle w:val="ListParagraph"/>
               <w:spacing w:after="0" w:line="240" w:lineRule="auto"/>
               <w:contextualSpacing w:val="0"/>
+              <w:jc w:val="both"/>
               <w:rPr>
                 <w:rFonts w:asciiTheme="minorHAnsi" w:hAnsiTheme="minorHAnsi" w:cs="Calibri"/>
                 <w:color w:val="FFFFFF" w:themeColor="background1"/>
@@ -2447,6 +2556,7 @@
               <w:pStyle w:val="ListParagraph"/>
               <w:spacing w:after="0" w:line="240" w:lineRule="auto"/>
               <w:contextualSpacing w:val="0"/>
+              <w:jc w:val="both"/>
               <w:cnfStyle w:val="000000000000" w:firstRow="0" w:lastRow="0" w:firstColumn="0" w:lastColumn="0" w:oddVBand="0" w:evenVBand="0" w:oddHBand="0" w:evenHBand="0" w:firstRowFirstColumn="0" w:firstRowLastColumn="0" w:lastRowFirstColumn="0" w:lastRowLastColumn="0"/>
               <w:rPr>
                 <w:rFonts w:asciiTheme="minorHAnsi" w:hAnsiTheme="minorHAnsi" w:cs="Calibri"/>
@@ -2478,6 +2588,7 @@
               <w:pStyle w:val="ListParagraph"/>
               <w:spacing w:after="0" w:line="240" w:lineRule="auto"/>
               <w:contextualSpacing w:val="0"/>
+              <w:jc w:val="both"/>
               <w:cnfStyle w:val="000000000000" w:firstRow="0" w:lastRow="0" w:firstColumn="0" w:lastColumn="0" w:oddVBand="0" w:evenVBand="0" w:oddHBand="0" w:evenHBand="0" w:firstRowFirstColumn="0" w:firstRowLastColumn="0" w:lastRowFirstColumn="0" w:lastRowLastColumn="0"/>
               <w:rPr>
                 <w:rFonts w:asciiTheme="minorHAnsi" w:hAnsiTheme="minorHAnsi" w:cs="Calibri"/>
@@ -2506,7 +2617,7 @@
           <w:p>
             <w:pPr>
               <w:spacing w:after="0" w:line="240" w:lineRule="auto"/>
-              <w:jc w:val="center"/>
+              <w:jc w:val="both"/>
               <w:cnfStyle w:val="000000000000" w:firstRow="0" w:lastRow="0" w:firstColumn="0" w:lastColumn="0" w:oddVBand="0" w:evenVBand="0" w:oddHBand="0" w:evenHBand="0" w:firstRowFirstColumn="0" w:firstRowLastColumn="0" w:lastRowFirstColumn="0" w:lastRowLastColumn="0"/>
               <w:rPr>
                 <w:rFonts w:asciiTheme="minorHAnsi" w:hAnsiTheme="minorHAnsi" w:cs="Calibri"/>
@@ -2563,6 +2674,7 @@
               <w:pStyle w:val="ListParagraph"/>
               <w:spacing w:after="0" w:line="240" w:lineRule="auto"/>
               <w:contextualSpacing w:val="0"/>
+              <w:jc w:val="both"/>
               <w:rPr>
                 <w:rFonts w:asciiTheme="minorHAnsi" w:hAnsiTheme="minorHAnsi" w:cs="Calibri"/>
                 <w:b w:val="0"/>
@@ -2616,7 +2728,7 @@
               <w:pStyle w:val="ListParagraph"/>
               <w:spacing w:after="0" w:line="240" w:lineRule="auto"/>
               <w:contextualSpacing w:val="0"/>
-              <w:jc w:val="center"/>
+              <w:jc w:val="both"/>
               <w:cnfStyle w:val="000000100000" w:firstRow="0" w:lastRow="0" w:firstColumn="0" w:lastColumn="0" w:oddVBand="0" w:evenVBand="0" w:oddHBand="1" w:evenHBand="0" w:firstRowFirstColumn="0" w:firstRowLastColumn="0" w:lastRowFirstColumn="0" w:lastRowLastColumn="0"/>
               <w:rPr>
                 <w:rFonts w:asciiTheme="minorHAnsi" w:hAnsiTheme="minorHAnsi" w:cs="Calibri"/>
@@ -2663,6 +2775,7 @@
               <w:pStyle w:val="ListParagraph"/>
               <w:spacing w:after="0" w:line="240" w:lineRule="auto"/>
               <w:contextualSpacing w:val="0"/>
+              <w:jc w:val="both"/>
               <w:cnfStyle w:val="000000100000" w:firstRow="0" w:lastRow="0" w:firstColumn="0" w:lastColumn="0" w:oddVBand="0" w:evenVBand="0" w:oddHBand="1" w:evenHBand="0" w:firstRowFirstColumn="0" w:firstRowLastColumn="0" w:lastRowFirstColumn="0" w:lastRowLastColumn="0"/>
               <w:rPr>
                 <w:rFonts w:asciiTheme="minorHAnsi" w:hAnsiTheme="minorHAnsi" w:cs="Calibri"/>
@@ -2917,7 +3030,7 @@
                 <w:noProof/>
                 <w:lang w:val="en-IN"/>
               </w:rPr>
-              <w:t>11 June 2026</w:t>
+              <w:t>12 June 2026</w:t>
             </w:r>
             <w:r>
               <w:rPr>
@@ -3072,7 +3185,7 @@
                 <w:noProof/>
                 <w:lang w:val="en-IN"/>
               </w:rPr>
-              <w:t>11 June 2026</w:t>
+              <w:t>12 June 2026</w:t>
             </w:r>
             <w:r>
               <w:rPr>
@@ -4488,12 +4601,12 @@
       </w:pPr>
     </w:p>
     <w:sectPr>
-      <w:headerReference w:type="even" r:id="rId9"/>
-      <w:headerReference w:type="default" r:id="rId10"/>
-      <w:footerReference w:type="even" r:id="rId11"/>
-      <w:footerReference w:type="default" r:id="rId12"/>
-      <w:headerReference w:type="first" r:id="rId13"/>
-      <w:footerReference w:type="first" r:id="rId14"/>
+      <w:headerReference w:type="even" r:id="rId8"/>
+      <w:headerReference w:type="default" r:id="rId9"/>
+      <w:footerReference w:type="even" r:id="rId10"/>
+      <w:footerReference w:type="default" r:id="rId11"/>
+      <w:headerReference w:type="first" r:id="rId12"/>
+      <w:footerReference w:type="first" r:id="rId13"/>
       <w:pgSz w:w="11906" w:h="16838"/>
       <w:pgMar w:top="1440" w:right="1440" w:bottom="1440" w:left="1440" w:header="708" w:footer="122" w:gutter="0"/>
       <w:cols w:space="708"/>

</xml_diff>